<commit_message>
docs: update user guide with 3-step quickstart for non-technical users
</commit_message>
<xml_diff>
--- a/Callie_Social_Content_Workflow_User_Guide.docx
+++ b/Callie_Social_Content_Workflow_User_Guide.docx
@@ -30,7 +30,6 @@
       </w:r>
     </w:p>
     <w:p/>
-    <w:p/>
     <w:p>
       <w:pPr>
         <w:jc w:val="center"/>
@@ -53,7 +52,7 @@
         <w:rPr>
           <w:sz w:val="24"/>
         </w:rPr>
-        <w:t>版本：v1.0.0 | 日期：2026-06-15</w:t>
+        <w:t>版本：v1.0.1 | 日期：2026-06-15</w:t>
       </w:r>
     </w:p>
     <w:p>
@@ -106,7 +105,7 @@
         <w:spacing w:after="80"/>
       </w:pPr>
       <w:r>
-        <w:t>5. 快速开始</w:t>
+        <w:t>5. 普通用户 3 步指南（推荐优先阅读）</w:t>
       </w:r>
     </w:p>
     <w:p>
@@ -114,7 +113,7 @@
         <w:spacing w:after="80"/>
       </w:pPr>
       <w:r>
-        <w:t>6. 完整工作流程</w:t>
+        <w:t>6. 快速开始</w:t>
       </w:r>
     </w:p>
     <w:p>
@@ -122,7 +121,7 @@
         <w:spacing w:after="80"/>
       </w:pPr>
       <w:r>
-        <w:t>7. CLI 工具详解</w:t>
+        <w:t>7. 完整工作流程</w:t>
       </w:r>
     </w:p>
     <w:p>
@@ -130,7 +129,7 @@
         <w:spacing w:after="80"/>
       </w:pPr>
       <w:r>
-        <w:t>8. Skill 使用说明</w:t>
+        <w:t>8. CLI 工具详解</w:t>
       </w:r>
     </w:p>
     <w:p>
@@ -138,7 +137,7 @@
         <w:spacing w:after="80"/>
       </w:pPr>
       <w:r>
-        <w:t>9. Workflow 使用说明</w:t>
+        <w:t>9. Skill 使用说明</w:t>
       </w:r>
     </w:p>
     <w:p>
@@ -146,7 +145,7 @@
         <w:spacing w:after="80"/>
       </w:pPr>
       <w:r>
-        <w:t>10. 输出说明</w:t>
+        <w:t>10. Workflow 使用说明</w:t>
       </w:r>
     </w:p>
     <w:p>
@@ -154,7 +153,23 @@
         <w:spacing w:after="80"/>
       </w:pPr>
       <w:r>
-        <w:t>11. 故障排除</w:t>
+        <w:t>11. 输出说明</w:t>
+      </w:r>
+    </w:p>
+    <w:p>
+      <w:pPr>
+        <w:spacing w:after="80"/>
+      </w:pPr>
+      <w:r>
+        <w:t>12. 故障排除</w:t>
+      </w:r>
+    </w:p>
+    <w:p>
+      <w:pPr>
+        <w:spacing w:after="80"/>
+      </w:pPr>
+      <w:r>
+        <w:t>附录</w:t>
       </w:r>
     </w:p>
     <w:p>
@@ -251,62 +266,6 @@
       </w:r>
       <w:r>
         <w:t>将内容包+图片打包为格式化 Excel，包含5个工作表</w:t>
-      </w:r>
-    </w:p>
-    <w:p>
-      <w:pPr>
-        <w:pStyle w:val="Heading2"/>
-      </w:pPr>
-      <w:r>
-        <w:t>输出成果</w:t>
-      </w:r>
-    </w:p>
-    <w:p>
-      <w:pPr>
-        <w:pStyle w:val="ListBullet"/>
-      </w:pPr>
-      <w:r>
-        <w:t>英文贴文文案（平台定制）</w:t>
-      </w:r>
-    </w:p>
-    <w:p>
-      <w:pPr>
-        <w:pStyle w:val="ListBullet"/>
-      </w:pPr>
-      <w:r>
-        <w:t>11个 Hashtag（TikTok 标准）</w:t>
-      </w:r>
-    </w:p>
-    <w:p>
-      <w:pPr>
-        <w:pStyle w:val="ListBullet"/>
-      </w:pPr>
-      <w:r>
-        <w:t>中文视频脚本（6个时间节点）</w:t>
-      </w:r>
-    </w:p>
-    <w:p>
-      <w:pPr>
-        <w:pStyle w:val="ListBullet"/>
-      </w:pPr>
-      <w:r>
-        <w:t>关键帧文字分镜描述</w:t>
-      </w:r>
-    </w:p>
-    <w:p>
-      <w:pPr>
-        <w:pStyle w:val="ListBullet"/>
-      </w:pPr>
-      <w:r>
-        <w:t>6张 AI 生成的9:16参考图</w:t>
-      </w:r>
-    </w:p>
-    <w:p>
-      <w:pPr>
-        <w:pStyle w:val="ListBullet"/>
-      </w:pPr>
-      <w:r>
-        <w:t>格式化 Excel 内容包（含5个工作表）</w:t>
       </w:r>
     </w:p>
     <w:p>
@@ -453,7 +412,7 @@
     </w:p>
     <w:p>
       <w:r>
-        <w:t>将项目文件夹复制到本地任意目录。项目路径中不应包含中文字符（避免编码问题）。</w:t>
+        <w:t>在 GitHub 仓库页面点击绿色 Code 按钮 → Download ZIP，解压到本地（路径中不要有中文）。</w:t>
       </w:r>
     </w:p>
     <w:p>
@@ -475,7 +434,7 @@
         </w:rPr>
         <w:t>pip install opencv-python openpyxl Pillow PyYAML httpx</w:t>
         <w:br/>
-        <w:t># 或一次性安装所有依赖：</w:t>
+        <w:t># 或一次性安装：</w:t>
         <w:br/>
         <w:t>pip install -r requirements.txt</w:t>
       </w:r>
@@ -490,7 +449,7 @@
     </w:p>
     <w:p>
       <w:r>
-        <w:t>复制配置文件模板，并填入你的 SiliconFlow API Key：</w:t>
+        <w:t>复制配置文件模板，填入 SiliconFlow API Key：</w:t>
       </w:r>
     </w:p>
     <w:p>
@@ -502,19 +461,14 @@
           <w:rFonts w:ascii="Courier New" w:hAnsi="Courier New"/>
           <w:sz w:val="18"/>
         </w:rPr>
-        <w:t># 复制配置模板</w:t>
-        <w:br/>
         <w:t>copy config.example.yaml config.yaml</w:t>
         <w:br/>
-        <w:br/>
-        <w:t># 编辑 config.yaml，填入 API Key</w:t>
-        <w:br/>
-        <w:t>siliconflow_api_key: "YOUR_ACTUAL_API_KEY"</w:t>
+        <w:t># 用记事本打开 config.yaml，找到 siliconflow_api_key，把 YOUR_API_KEY_HERE 改成你的真实 Key</w:t>
       </w:r>
     </w:p>
     <w:p>
       <w:r>
-        <w:t>或者设置环境变量（跨电脑更方便）：</w:t>
+        <w:t>或设置环境变量（优先级更高）：</w:t>
       </w:r>
     </w:p>
     <w:p>
@@ -526,9 +480,7 @@
           <w:rFonts w:ascii="Courier New" w:hAnsi="Courier New"/>
           <w:sz w:val="18"/>
         </w:rPr>
-        <w:t>export SILICONFLOW_API_KEY="your_api_key_here"  # macOS/Linux</w:t>
-        <w:br/>
-        <w:t>set SILICONFLOW_API_KEY="your_api_key_here"      # Windows</w:t>
+        <w:t>set SILICONFLOW_API_KEY=你的Key   # Windows PowerShell</w:t>
       </w:r>
     </w:p>
     <w:p>
@@ -550,33 +502,27 @@
         </w:rPr>
         <w:t>callie-social-content-workflow/</w:t>
         <w:br/>
-        <w:t>├── config.example.yaml           # 配置文件模板</w:t>
+        <w:t>├── config.example.yaml</w:t>
         <w:br/>
-        <w:t>├── workflow.social-content.yaml  # Workflow 编排文件</w:t>
+        <w:t>├── workflow.social-content.yaml</w:t>
         <w:br/>
-        <w:t>├── requirements.txt              # Python 依赖列表</w:t>
+        <w:t>├── requirements.txt</w:t>
         <w:br/>
-        <w:t>│</w:t>
+        <w:t>├── scripts/</w:t>
         <w:br/>
-        <w:t>├── scripts/                      # CLI 工具</w:t>
-        <w:br/>
-        <w:t>│   ├── extract_frames.py         # 视频帧提取</w:t>
+        <w:t>│   ├── extract_frames.py        # 视频帧提取</w:t>
         <w:br/>
         <w:t>│   ├── generate_keyframes.py     # 关键帧AI生图</w:t>
         <w:br/>
-        <w:t>│   └── build_excel.py            # Excel输出</w:t>
-        <w:br/>
-        <w:t>│</w:t>
+        <w:t>│   └── build_excel.py           # Excel输出</w:t>
         <w:br/>
         <w:t>├── skills/</w:t>
         <w:br/>
         <w:t>│   └── social-content-generator/</w:t>
         <w:br/>
-        <w:t>│       └── SKILL.md              # 主 Skill（Prompt 模板）</w:t>
+        <w:t>│       └── SKILL.md</w:t>
         <w:br/>
-        <w:t>│</w:t>
-        <w:br/>
-        <w:t>├── references/                   # 品牌/平台规则（已有）</w:t>
+        <w:t>├── references/</w:t>
         <w:br/>
         <w:t>│   ├── brand-guide.md</w:t>
         <w:br/>
@@ -584,15 +530,18 @@
         <w:br/>
         <w:t>│   └── output-format.md</w:t>
         <w:br/>
-        <w:t>│</w:t>
+        <w:t>└── output/</w:t>
         <w:br/>
-        <w:t>└── output/                       # 输出目录（自动创建）</w:t>
+        <w:t xml:space="preserve">    ├── frames/                  # 视频帧图片</w:t>
         <w:br/>
-        <w:t xml:space="preserve">    ├── frames/                    # 视频帧图片</w:t>
+        <w:t xml:space="preserve">    ├── keyframes/               # AI关键帧参考图</w:t>
         <w:br/>
-        <w:t xml:space="preserve">    ├── keyframes/                 # AI关键帧参考图</w:t>
-        <w:br/>
-        <w:t xml:space="preserve">    └── Callie_Content_Pack.xlsx   # 最终Excel输出</w:t>
+        <w:t xml:space="preserve">    └── Callie_Content_Pack.xlsx  # 最终Excel</w:t>
+      </w:r>
+    </w:p>
+    <w:p>
+      <w:r>
+        <w:br w:type="page"/>
       </w:r>
     </w:p>
     <w:p>
@@ -600,7 +549,15 @@
         <w:pStyle w:val="Heading1"/>
       </w:pPr>
       <w:r>
-        <w:t>5. 快速开始</w:t>
+        <w:t>5. 普通用户 3 步指南（推荐优先阅读）</w:t>
+      </w:r>
+    </w:p>
+    <w:p>
+      <w:r>
+        <w:rPr>
+          <w:sz w:val="22"/>
+        </w:rPr>
+        <w:t>以下指南专为不具备编程背景的普通用户编写。只需按顺序执行 3 个命令，即可完成全部流程。</w:t>
       </w:r>
     </w:p>
     <w:p>
@@ -608,12 +565,527 @@
         <w:pStyle w:val="Heading2"/>
       </w:pPr>
       <w:r>
-        <w:t>5.1 视频帧提取</w:t>
+        <w:t>5.1 你需要准备什么（输入）</w:t>
+      </w:r>
+    </w:p>
+    <w:tbl>
+      <w:tblPr>
+        <w:tblStyle w:val="TableGrid"/>
+        <w:tblW w:type="auto" w:w="0"/>
+        <w:tblLook w:firstColumn="1" w:firstRow="1" w:lastColumn="0" w:lastRow="0" w:noHBand="0" w:noVBand="1" w:val="04A0"/>
+      </w:tblPr>
+      <w:tblGrid>
+        <w:gridCol w:w="3010"/>
+        <w:gridCol w:w="3010"/>
+        <w:gridCol w:w="3010"/>
+      </w:tblGrid>
+      <w:tr>
+        <w:tc>
+          <w:tcPr>
+            <w:tcW w:type="dxa" w:w="3010"/>
+            <w:shd w:val="clear" w:color="auto" w:fill="1F4E79"/>
+          </w:tcPr>
+          <w:p>
+            <w:r>
+              <w:rPr>
+                <w:b/>
+                <w:color w:val="FFFFFF"/>
+              </w:rPr>
+              <w:t>准备项</w:t>
+            </w:r>
+          </w:p>
+        </w:tc>
+        <w:tc>
+          <w:tcPr>
+            <w:tcW w:type="dxa" w:w="3010"/>
+            <w:shd w:val="clear" w:color="auto" w:fill="1F4E79"/>
+          </w:tcPr>
+          <w:p>
+            <w:r>
+              <w:rPr>
+                <w:b/>
+                <w:color w:val="FFFFFF"/>
+              </w:rPr>
+              <w:t>说明</w:t>
+            </w:r>
+          </w:p>
+        </w:tc>
+        <w:tc>
+          <w:tcPr>
+            <w:tcW w:type="dxa" w:w="3010"/>
+            <w:shd w:val="clear" w:color="auto" w:fill="1F4E79"/>
+          </w:tcPr>
+          <w:p>
+            <w:r>
+              <w:rPr>
+                <w:b/>
+                <w:color w:val="FFFFFF"/>
+              </w:rPr>
+              <w:t>示例</w:t>
+            </w:r>
+          </w:p>
+        </w:tc>
+      </w:tr>
+      <w:tr>
+        <w:tc>
+          <w:tcPr>
+            <w:tcW w:type="dxa" w:w="3010"/>
+          </w:tcPr>
+          <w:p>
+            <w:r>
+              <w:t>产品图片</w:t>
+            </w:r>
+          </w:p>
+        </w:tc>
+        <w:tc>
+          <w:tcPr>
+            <w:tcW w:type="dxa" w:w="3010"/>
+          </w:tcPr>
+          <w:p>
+            <w:r>
+              <w:t>1-3张清晰产品图</w:t>
+            </w:r>
+          </w:p>
+        </w:tc>
+        <w:tc>
+          <w:tcPr>
+            <w:tcW w:type="dxa" w:w="3010"/>
+          </w:tcPr>
+          <w:p>
+            <w:r>
+              <w:t>木盒相册.jpg</w:t>
+            </w:r>
+          </w:p>
+        </w:tc>
+      </w:tr>
+      <w:tr>
+        <w:tc>
+          <w:tcPr>
+            <w:tcW w:type="dxa" w:w="3010"/>
+          </w:tcPr>
+          <w:p>
+            <w:r>
+              <w:t>产品链接</w:t>
+            </w:r>
+          </w:p>
+        </w:tc>
+        <w:tc>
+          <w:tcPr>
+            <w:tcW w:type="dxa" w:w="3010"/>
+          </w:tcPr>
+          <w:p>
+            <w:r>
+              <w:t>可选</w:t>
+            </w:r>
+          </w:p>
+        </w:tc>
+        <w:tc>
+          <w:tcPr>
+            <w:tcW w:type="dxa" w:w="3010"/>
+          </w:tcPr>
+          <w:p>
+            <w:r>
+              <w:t>https://www.callie.com/...</w:t>
+            </w:r>
+          </w:p>
+        </w:tc>
+      </w:tr>
+      <w:tr>
+        <w:tc>
+          <w:tcPr>
+            <w:tcW w:type="dxa" w:w="3010"/>
+          </w:tcPr>
+          <w:p>
+            <w:r>
+              <w:t>热门竞品视频</w:t>
+            </w:r>
+          </w:p>
+        </w:tc>
+        <w:tc>
+          <w:tcPr>
+            <w:tcW w:type="dxa" w:w="3010"/>
+          </w:tcPr>
+          <w:p>
+            <w:r>
+              <w:t>1个 mp4/mov 文件</w:t>
+            </w:r>
+          </w:p>
+        </w:tc>
+        <w:tc>
+          <w:tcPr>
+            <w:tcW w:type="dxa" w:w="3010"/>
+          </w:tcPr>
+          <w:p>
+            <w:r>
+              <w:t>竞品视频.mp4</w:t>
+            </w:r>
+          </w:p>
+        </w:tc>
+      </w:tr>
+      <w:tr>
+        <w:tc>
+          <w:tcPr>
+            <w:tcW w:type="dxa" w:w="3010"/>
+          </w:tcPr>
+          <w:p>
+            <w:r>
+              <w:t>SiliconFlow API Key</w:t>
+            </w:r>
+          </w:p>
+        </w:tc>
+        <w:tc>
+          <w:tcPr>
+            <w:tcW w:type="dxa" w:w="3010"/>
+          </w:tcPr>
+          <w:p>
+            <w:r>
+              <w:t>AI生图用（免费额度）</w:t>
+            </w:r>
+          </w:p>
+        </w:tc>
+        <w:tc>
+          <w:tcPr>
+            <w:tcW w:type="dxa" w:w="3010"/>
+          </w:tcPr>
+          <w:p>
+            <w:r>
+              <w:t>sk-xxxxx</w:t>
+            </w:r>
+          </w:p>
+        </w:tc>
+      </w:tr>
+    </w:tbl>
+    <w:p/>
+    <w:p>
+      <w:pPr>
+        <w:pStyle w:val="Heading2"/>
+      </w:pPr>
+      <w:r>
+        <w:t>5.2 Step 1：提取视频关键帧</w:t>
       </w:r>
     </w:p>
     <w:p>
       <w:r>
-        <w:t>将热门竞品视频文件准备好，然后运行：</w:t>
+        <w:t>将竞品视频文件（如 竞品视频.mp4）放进项目文件夹，然后运行：</w:t>
+      </w:r>
+    </w:p>
+    <w:p>
+      <w:pPr>
+        <w:ind w:left="432"/>
+      </w:pPr>
+      <w:r>
+        <w:rPr>
+          <w:rFonts w:ascii="Courier New" w:hAnsi="Courier New"/>
+          <w:sz w:val="18"/>
+        </w:rPr>
+        <w:t>python scripts\extract_frames.py 竞品视频.mp4 frames</w:t>
+      </w:r>
+    </w:p>
+    <w:p>
+      <w:r>
+        <w:t>成功标志：frames/ 文件夹中出现 frame_00s.jpg、frame_03s.jpg 等图片。</w:t>
+      </w:r>
+    </w:p>
+    <w:p>
+      <w:pPr>
+        <w:pStyle w:val="Heading2"/>
+      </w:pPr>
+      <w:r>
+        <w:t>5.3 Step 2：生成关键帧 AI 参考图</w:t>
+      </w:r>
+    </w:p>
+    <w:p>
+      <w:r>
+        <w:t>运行以下命令，生成 6 张 9:16 竖版参考图：</w:t>
+      </w:r>
+    </w:p>
+    <w:p>
+      <w:pPr>
+        <w:ind w:left="432"/>
+      </w:pPr>
+      <w:r>
+        <w:rPr>
+          <w:rFonts w:ascii="Courier New" w:hAnsi="Courier New"/>
+          <w:sz w:val="18"/>
+        </w:rPr>
+        <w:t>python scripts\generate_keyframes.py keyframes -n 6</w:t>
+      </w:r>
+    </w:p>
+    <w:p>
+      <w:r>
+        <w:t>成功标志：keyframes/ 文件夹中出现 keyframe_01.jpg ~ keyframe_06.jpg 共 6 张图片。</w:t>
+      </w:r>
+    </w:p>
+    <w:p>
+      <w:pPr>
+        <w:pStyle w:val="Heading2"/>
+      </w:pPr>
+      <w:r>
+        <w:t>5.4 Step 3：打包 Excel 内容包</w:t>
+      </w:r>
+    </w:p>
+    <w:p>
+      <w:r>
+        <w:t>运行此命令前，需要先把 AI 生成的内容（贴文文案/脚本/分镜）整理成 JSON 格式文件。如果你已经通过 AI Agent 生成了内容包 JSON，运行：</w:t>
+      </w:r>
+    </w:p>
+    <w:p>
+      <w:pPr>
+        <w:ind w:left="432"/>
+      </w:pPr>
+      <w:r>
+        <w:rPr>
+          <w:rFonts w:ascii="Courier New" w:hAnsi="Courier New"/>
+          <w:sz w:val="18"/>
+        </w:rPr>
+        <w:t>python scripts\build_excel.py 内容包.json 输出文件名.xlsx --keyframes keyframes</w:t>
+      </w:r>
+    </w:p>
+    <w:p>
+      <w:r>
+        <w:t>成功标志：生成 .xlsx 文件，打开后有 5 个工作表，关键帧图片已嵌入。</w:t>
+      </w:r>
+    </w:p>
+    <w:p>
+      <w:pPr>
+        <w:pStyle w:val="Heading2"/>
+      </w:pPr>
+      <w:r>
+        <w:t>5.5 你最终得到什么（输出）</w:t>
+      </w:r>
+    </w:p>
+    <w:tbl>
+      <w:tblPr>
+        <w:tblStyle w:val="TableGrid"/>
+        <w:tblW w:type="auto" w:w="0"/>
+        <w:tblLook w:firstColumn="1" w:firstRow="1" w:lastColumn="0" w:lastRow="0" w:noHBand="0" w:noVBand="1" w:val="04A0"/>
+      </w:tblPr>
+      <w:tblGrid>
+        <w:gridCol w:w="4514"/>
+        <w:gridCol w:w="4514"/>
+      </w:tblGrid>
+      <w:tr>
+        <w:tc>
+          <w:tcPr>
+            <w:tcW w:type="dxa" w:w="4514"/>
+            <w:shd w:val="clear" w:color="auto" w:fill="1F4E79"/>
+          </w:tcPr>
+          <w:p>
+            <w:r>
+              <w:rPr>
+                <w:b/>
+                <w:color w:val="FFFFFF"/>
+              </w:rPr>
+              <w:t>文件内容</w:t>
+            </w:r>
+          </w:p>
+        </w:tc>
+        <w:tc>
+          <w:tcPr>
+            <w:tcW w:type="dxa" w:w="4514"/>
+            <w:shd w:val="clear" w:color="auto" w:fill="1F4E79"/>
+          </w:tcPr>
+          <w:p>
+            <w:r>
+              <w:rPr>
+                <w:b/>
+                <w:color w:val="FFFFFF"/>
+              </w:rPr>
+              <w:t>说明</w:t>
+            </w:r>
+          </w:p>
+        </w:tc>
+      </w:tr>
+      <w:tr>
+        <w:tc>
+          <w:tcPr>
+            <w:tcW w:type="dxa" w:w="4514"/>
+          </w:tcPr>
+          <w:p>
+            <w:r>
+              <w:t>英文贴文</w:t>
+            </w:r>
+          </w:p>
+        </w:tc>
+        <w:tc>
+          <w:tcPr>
+            <w:tcW w:type="dxa" w:w="4514"/>
+          </w:tcPr>
+          <w:p>
+            <w:r>
+              <w:t>可直接在 Instagram/TikTok 发布的英文文案</w:t>
+            </w:r>
+          </w:p>
+        </w:tc>
+      </w:tr>
+      <w:tr>
+        <w:tc>
+          <w:tcPr>
+            <w:tcW w:type="dxa" w:w="4514"/>
+          </w:tcPr>
+          <w:p>
+            <w:r>
+              <w:t>11个 Hashtag</w:t>
+            </w:r>
+          </w:p>
+        </w:tc>
+        <w:tc>
+          <w:tcPr>
+            <w:tcW w:type="dxa" w:w="4514"/>
+          </w:tcPr>
+          <w:p>
+            <w:r>
+              <w:t>空格分隔，可直接复制使用</w:t>
+            </w:r>
+          </w:p>
+        </w:tc>
+      </w:tr>
+      <w:tr>
+        <w:tc>
+          <w:tcPr>
+            <w:tcW w:type="dxa" w:w="4514"/>
+          </w:tcPr>
+          <w:p>
+            <w:r>
+              <w:t>中文视频脚本</w:t>
+            </w:r>
+          </w:p>
+        </w:tc>
+        <w:tc>
+          <w:tcPr>
+            <w:tcW w:type="dxa" w:w="4514"/>
+          </w:tcPr>
+          <w:p>
+            <w:r>
+              <w:t>6 个时间节点，画面/镜头/文字Overlay全有</w:t>
+            </w:r>
+          </w:p>
+        </w:tc>
+      </w:tr>
+      <w:tr>
+        <w:tc>
+          <w:tcPr>
+            <w:tcW w:type="dxa" w:w="4514"/>
+          </w:tcPr>
+          <w:p>
+            <w:r>
+              <w:t>6 张关键帧参考图</w:t>
+            </w:r>
+          </w:p>
+        </w:tc>
+        <w:tc>
+          <w:tcPr>
+            <w:tcW w:type="dxa" w:w="4514"/>
+          </w:tcPr>
+          <w:p>
+            <w:r>
+              <w:t>AI 生成的 9:16 竖版示意图</w:t>
+            </w:r>
+          </w:p>
+        </w:tc>
+      </w:tr>
+      <w:tr>
+        <w:tc>
+          <w:tcPr>
+            <w:tcW w:type="dxa" w:w="4514"/>
+          </w:tcPr>
+          <w:p>
+            <w:r>
+              <w:t>格式化 Excel</w:t>
+            </w:r>
+          </w:p>
+        </w:tc>
+        <w:tc>
+          <w:tcPr>
+            <w:tcW w:type="dxa" w:w="4514"/>
+          </w:tcPr>
+          <w:p>
+            <w:r>
+              <w:t>5 个工作表，内容+图片一体化</w:t>
+            </w:r>
+          </w:p>
+        </w:tc>
+      </w:tr>
+    </w:tbl>
+    <w:p/>
+    <w:p>
+      <w:pPr>
+        <w:pStyle w:val="Heading2"/>
+      </w:pPr>
+      <w:r>
+        <w:t>5.6 流程图（极简版）</w:t>
+      </w:r>
+    </w:p>
+    <w:p>
+      <w:pPr>
+        <w:ind w:left="432"/>
+      </w:pPr>
+      <w:r>
+        <w:rPr>
+          <w:rFonts w:ascii="Courier New" w:hAnsi="Courier New"/>
+          <w:sz w:val="18"/>
+        </w:rPr>
+        <w:t>准备：产品图 + 竞品视频 + SiliconFlow API Key</w:t>
+        <w:br/>
+        <w:t xml:space="preserve">         |</w:t>
+        <w:br/>
+        <w:t xml:space="preserve">         v</w:t>
+        <w:br/>
+        <w:t>Step 1: extract_frames.py  --&gt;  提取视频帧图片</w:t>
+        <w:br/>
+        <w:t xml:space="preserve">         |</w:t>
+        <w:br/>
+        <w:t xml:space="preserve">         v</w:t>
+        <w:br/>
+        <w:t>Step 2: generate_keyframes.py  --&gt;  AI 生成 6 张参考图</w:t>
+        <w:br/>
+        <w:t xml:space="preserve">         |</w:t>
+        <w:br/>
+        <w:t xml:space="preserve">         v</w:t>
+        <w:br/>
+        <w:t>Step 3: build_excel.py  --&gt;  打包成 Excel 内容包</w:t>
+        <w:br/>
+        <w:t xml:space="preserve">         |</w:t>
+        <w:br/>
+        <w:t xml:space="preserve">         v</w:t>
+        <w:br/>
+        <w:t>结果：英文贴文 + 11 Hashtag + 中文脚本 + 关键帧图 + Excel</w:t>
+      </w:r>
+    </w:p>
+    <w:p>
+      <w:pPr>
+        <w:ind w:left="432"/>
+      </w:pPr>
+      <w:r>
+        <w:rPr>
+          <w:b/>
+          <w:color w:val="C55A11"/>
+        </w:rPr>
+        <w:t xml:space="preserve">[提示] </w:t>
+      </w:r>
+      <w:r>
+        <w:t>如果运行过程中出现错误，请跳转到本文档第 12 节「故障排除」查找解决方案。</w:t>
+      </w:r>
+    </w:p>
+    <w:p>
+      <w:r>
+        <w:br w:type="page"/>
+      </w:r>
+    </w:p>
+    <w:p>
+      <w:pPr>
+        <w:pStyle w:val="Heading1"/>
+      </w:pPr>
+      <w:r>
+        <w:t>6. 快速开始</w:t>
+      </w:r>
+    </w:p>
+    <w:p>
+      <w:pPr>
+        <w:pStyle w:val="Heading2"/>
+      </w:pPr>
+      <w:r>
+        <w:t>视频帧提取</w:t>
       </w:r>
     </w:p>
     <w:p>
@@ -626,16 +1098,11 @@
           <w:sz w:val="18"/>
         </w:rPr>
         <w:t>python scripts/extract_frames.py "视频文件.mp4" frames/</w:t>
-        <w:br/>
-        <w:br/>
-        <w:t># 示例：</w:t>
-        <w:br/>
-        <w:t>python scripts/extract_frames.py "memoryflick_video.mp4" output/frames/</w:t>
       </w:r>
     </w:p>
     <w:p>
       <w:r>
-        <w:t>输出：frames/frame_00s.jpg, frames/frame_03s.jpg, frames/frame_08s.jpg 等</w:t>
+        <w:t>输出：frames/frame_00s.jpg, frames/frame_03s.jpg 等</w:t>
       </w:r>
     </w:p>
     <w:p>
@@ -643,12 +1110,7 @@
         <w:pStyle w:val="Heading2"/>
       </w:pPr>
       <w:r>
-        <w:t>5.2 AI 内容生成（由 AI Agent 执行）</w:t>
-      </w:r>
-    </w:p>
-    <w:p>
-      <w:r>
-        <w:t>将以下内容交给 AI Agent（或使用支持 Skill 的 AI 助手）：</w:t>
+        <w:t>AI 关键帧生图</w:t>
       </w:r>
     </w:p>
     <w:p>
@@ -660,31 +1122,12 @@
           <w:rFonts w:ascii="Courier New" w:hAnsi="Courier New"/>
           <w:sz w:val="18"/>
         </w:rPr>
-        <w:t># 加载 Skill：</w:t>
-        <w:br/>
-        <w:t>skills/social-content-generator/SKILL.md</w:t>
-        <w:br/>
-        <w:br/>
-        <w:t># 提供输入：</w:t>
-        <w:br/>
-        <w:t>- 产品图片（1-3张）</w:t>
-        <w:br/>
-        <w:t>- 产品链接（可选）</w:t>
-        <w:br/>
-        <w:t>- 热门视频文件</w:t>
-        <w:br/>
-        <w:t>- 目标平台（如 Instagram）</w:t>
-        <w:br/>
-        <w:br/>
-        <w:t># AI Agent 将执行：</w:t>
-        <w:br/>
-        <w:t># 1. 分析产品图片 → 提取产品信息</w:t>
-        <w:br/>
-        <w:t># 2. 分析视频帧 → 提取视频结构</w:t>
-        <w:br/>
-        <w:t># 3. 生成完整内容包</w:t>
-        <w:br/>
-        <w:t># 4. 输出结构化 JSON</w:t>
+        <w:t>python scripts/generate_keyframes.py keyframes/ -n 6</w:t>
+      </w:r>
+    </w:p>
+    <w:p>
+      <w:r>
+        <w:t>输出：keyframes/keyframe_01.jpg ~ keyframe_06.jpg (9:16 竖版)</w:t>
       </w:r>
     </w:p>
     <w:p>
@@ -692,12 +1135,7 @@
         <w:pStyle w:val="Heading2"/>
       </w:pPr>
       <w:r>
-        <w:t>5.3 AI 关键帧生图</w:t>
-      </w:r>
-    </w:p>
-    <w:p>
-      <w:r>
-        <w:t>内容包确认后，生成关键帧参考图：</w:t>
+        <w:t>Excel 输出</w:t>
       </w:r>
     </w:p>
     <w:p>
@@ -709,44 +1147,12 @@
           <w:rFonts w:ascii="Courier New" w:hAnsi="Courier New"/>
           <w:sz w:val="18"/>
         </w:rPr>
-        <w:t>python scripts/generate_keyframes.py keyframes/ --config config.yaml --count 6</w:t>
-        <w:br/>
-        <w:br/>
-        <w:t># 输出：</w:t>
-        <w:br/>
-        <w:t># keyframes/keyframe_01.jpg ~ keyframe_06.jpg (9:16 竖版)</w:t>
-        <w:br/>
-        <w:t># keyframes/keyframe_storyboard.json (分镜数据)</w:t>
-      </w:r>
-    </w:p>
-    <w:p>
-      <w:pPr>
-        <w:pStyle w:val="Heading2"/>
-      </w:pPr>
-      <w:r>
-        <w:t>5.4 Excel 输出</w:t>
+        <w:t>python scripts/build_excel.py content.json "Output.xlsx" --keyframes keyframes/</w:t>
       </w:r>
     </w:p>
     <w:p>
       <w:r>
-        <w:t>将 AI 生成的内容 JSON 和关键帧图片打包为 Excel：</w:t>
-      </w:r>
-    </w:p>
-    <w:p>
-      <w:pPr>
-        <w:ind w:left="432"/>
-      </w:pPr>
-      <w:r>
-        <w:rPr>
-          <w:rFonts w:ascii="Courier New" w:hAnsi="Courier New"/>
-          <w:sz w:val="18"/>
-        </w:rPr>
-        <w:t>python scripts/build_excel.py content_data.json output/Callie_Instagram_Pack.xlsx --keyframes keyframes/</w:t>
-      </w:r>
-    </w:p>
-    <w:p>
-      <w:r>
-        <w:t>输出：包含5个工作表的格式化 Excel 文件，已嵌入6张关键帧参考图。</w:t>
+        <w:t>输出：包含5个工作表的格式化 Excel 文件</w:t>
       </w:r>
     </w:p>
     <w:p>
@@ -754,7 +1160,7 @@
         <w:pStyle w:val="Heading1"/>
       </w:pPr>
       <w:r>
-        <w:t>6. 完整工作流程</w:t>
+        <w:t>7. 完整工作流程</w:t>
       </w:r>
     </w:p>
     <w:p>
@@ -784,9 +1190,7 @@
       <w:r>
         <w:t>上传热门视频 → extract_frames.py 提取帧 → AI Vision 分析结构</w:t>
         <w:br/>
-        <w:t>输出：Hook类型/CTA类型/叙事结构/节奏分布</w:t>
-        <w:br/>
-        <w:t>（可跳过，直接用产品信息生成）</w:t>
+        <w:t>输出：Hook类型/CTA类型/叙事结构/节奏分布（可跳过）</w:t>
       </w:r>
     </w:p>
     <w:p>
@@ -824,7 +1228,7 @@
         <w:pStyle w:val="Heading1"/>
       </w:pPr>
       <w:r>
-        <w:t>7. CLI 工具详解</w:t>
+        <w:t>8. CLI 工具详解</w:t>
       </w:r>
     </w:p>
     <w:p>
@@ -832,12 +1236,7 @@
         <w:pStyle w:val="Heading2"/>
       </w:pPr>
       <w:r>
-        <w:t>7.1 extract_frames.py — 视频帧提取</w:t>
-      </w:r>
-    </w:p>
-    <w:p>
-      <w:r>
-        <w:t>从视频文件中按指定时间点提取关键帧图片。</w:t>
+        <w:t>extract_frames.py — 视频帧提取</w:t>
       </w:r>
     </w:p>
     <w:p>
@@ -849,24 +1248,16 @@
           <w:rFonts w:ascii="Courier New" w:hAnsi="Courier New"/>
           <w:sz w:val="18"/>
         </w:rPr>
-        <w:t>python scripts/extract_frames.py &lt;视频文件&gt; [输出目录] [选项]</w:t>
+        <w:t>python scripts/extract_frames.py &lt;视频文件&gt; [输出目录] [-t 时间点]</w:t>
         <w:br/>
         <w:br/>
         <w:t>参数：</w:t>
         <w:br/>
-        <w:t xml:space="preserve">  视频文件          必填，视频文件路径（mp4/mov/avi）</w:t>
+        <w:t xml:space="preserve">  视频文件   必填，视频路径（mp4/mov/avi）</w:t>
         <w:br/>
-        <w:t xml:space="preserve">  输出目录          可选，默认为 frames/</w:t>
+        <w:t xml:space="preserve">  输出目录   可选，默认 frames/</w:t>
         <w:br/>
-        <w:br/>
-        <w:t>选项：</w:t>
-        <w:br/>
-        <w:t xml:space="preserve">  -t, --timestamps  自定义时间点，逗号分隔，如 '0,3,8,15,22,30'</w:t>
-        <w:br/>
-        <w:br/>
-        <w:t>示例：</w:t>
-        <w:br/>
-        <w:t xml:space="preserve">  python scripts/extract_frames.py "video.mp4" my_frames/ -t "0,5,15,25"</w:t>
+        <w:t xml:space="preserve">  -t          自定义时间点，如 -t 0,3,8,15,22,30</w:t>
       </w:r>
     </w:p>
     <w:p>
@@ -874,12 +1265,7 @@
         <w:pStyle w:val="Heading2"/>
       </w:pPr>
       <w:r>
-        <w:t>7.2 generate_keyframes.py — 关键帧AI生图</w:t>
-      </w:r>
-    </w:p>
-    <w:p>
-      <w:r>
-        <w:t>调用 SiliconFlow Qwen-Image API 生成关键帧参考图（9:16竖版）。</w:t>
+        <w:t>generate_keyframes.py — 关键帧AI生图</w:t>
       </w:r>
     </w:p>
     <w:p>
@@ -891,31 +1277,23 @@
           <w:rFonts w:ascii="Courier New" w:hAnsi="Courier New"/>
           <w:sz w:val="18"/>
         </w:rPr>
-        <w:t>python scripts/generate_keyframes.py [输出目录] [选项]</w:t>
+        <w:t>python scripts/generate_keyframes.py [输出目录] [-c config.yaml] [-n 6] [-s 1024x1792]</w:t>
         <w:br/>
         <w:br/>
         <w:t>参数：</w:t>
         <w:br/>
-        <w:t xml:space="preserve">  输出目录          可选，默认为 keyframes/</w:t>
+        <w:t xml:space="preserve">  输出目录   可选，默认 keyframes/</w:t>
         <w:br/>
+        <w:t xml:space="preserve">  -c          配置文件，默认 config.yaml</w:t>
         <w:br/>
-        <w:t>选项：</w:t>
+        <w:t xml:space="preserve">  -n          生成数量，默认 6</w:t>
         <w:br/>
-        <w:t xml:space="preserve">  -c, --config      配置文件路径，默认 config.yaml</w:t>
-        <w:br/>
-        <w:t xml:space="preserve">  -n, --count       生成数量，默认 6</w:t>
-        <w:br/>
-        <w:t xml:space="preserve">  -s, --size        图像尺寸，默认 1024x1792（9:16）</w:t>
-        <w:br/>
-        <w:br/>
-        <w:t>环境变量：</w:t>
-        <w:br/>
-        <w:t xml:space="preserve">  SILICONFLOW_API_KEY   API Key（优先级高于 config.yaml）</w:t>
-        <w:br/>
-        <w:br/>
-        <w:t>示例：</w:t>
-        <w:br/>
-        <w:t xml:space="preserve">  python scripts/generate_keyframes.py my_keyframes/ -n 6 -s "1024x1792"</w:t>
+        <w:t xml:space="preserve">  -s          图像尺寸，默认 1024x1792（9:16）</w:t>
+      </w:r>
+    </w:p>
+    <w:p>
+      <w:r>
+        <w:t>环境变量：SILICONFLOW_API_KEY（优先级高于 config.yaml）</w:t>
       </w:r>
     </w:p>
     <w:p>
@@ -923,12 +1301,7 @@
         <w:pStyle w:val="Heading2"/>
       </w:pPr>
       <w:r>
-        <w:t>7.3 build_excel.py — Excel输出</w:t>
-      </w:r>
-    </w:p>
-    <w:p>
-      <w:r>
-        <w:t>将内容包 JSON 和关键帧图片打包为格式化 Excel。</w:t>
+        <w:t>build_excel.py — Excel输出</w:t>
       </w:r>
     </w:p>
     <w:p>
@@ -940,24 +1313,16 @@
           <w:rFonts w:ascii="Courier New" w:hAnsi="Courier New"/>
           <w:sz w:val="18"/>
         </w:rPr>
-        <w:t>python scripts/build_excel.py &lt;内容JSON&gt; &lt;输出文件&gt; [选项]</w:t>
+        <w:t>python scripts/build_excel.py &lt;内容JSON&gt; &lt;输出文件&gt; [-k 关键帧目录]</w:t>
         <w:br/>
         <w:br/>
         <w:t>参数：</w:t>
         <w:br/>
-        <w:t xml:space="preserve">  内容JSON           必填，内容数据 JSON 文件路径或 JSON 字符串</w:t>
+        <w:t xml:space="preserve">  内容JSON   必填，内容数据 JSON 文件路径</w:t>
         <w:br/>
-        <w:t xml:space="preserve">  输出文件           必填，输出 Excel 文件路径</w:t>
+        <w:t xml:space="preserve">  输出文件   必填，输出 Excel 路径</w:t>
         <w:br/>
-        <w:br/>
-        <w:t>选项：</w:t>
-        <w:br/>
-        <w:t xml:space="preserve">  -k, --keyframes    关键帧图片目录，默认 keyframes/</w:t>
-        <w:br/>
-        <w:br/>
-        <w:t>示例：</w:t>
-        <w:br/>
-        <w:t xml:space="preserve">  python scripts/build_excel.py content.json "Output.xlsx" --keyframes keyframes/</w:t>
+        <w:t xml:space="preserve">  -k          关键帧图片目录，默认 keyframes/</w:t>
       </w:r>
     </w:p>
     <w:p>
@@ -965,41 +1330,12 @@
         <w:pStyle w:val="Heading1"/>
       </w:pPr>
       <w:r>
-        <w:t>8. Skill 使用说明</w:t>
+        <w:t>9. Skill 使用说明</w:t>
       </w:r>
     </w:p>
     <w:p>
       <w:r>
-        <w:t>Skill 文件（SKILL.md）是 Prompt 模板，用于指导 AI Agent 执行内容生成。它定义了输入/输出格式、工作流程和质量标准。</w:t>
-      </w:r>
-    </w:p>
-    <w:p>
-      <w:pPr>
-        <w:pStyle w:val="Heading2"/>
-      </w:pPr>
-      <w:r>
-        <w:t>如何加载 Skill</w:t>
-      </w:r>
-    </w:p>
-    <w:p>
-      <w:r>
-        <w:t>将 SKILL.md 的内容作为系统提示（System Prompt）或工具描述加载给 AI Agent。不同的 AI Agent 平台加载方式不同：</w:t>
-      </w:r>
-    </w:p>
-    <w:p>
-      <w:pPr>
-        <w:pStyle w:val="ListBullet"/>
-      </w:pPr>
-      <w:r>
-        <w:t>Claude Code：放入项目 skills/ 目录，Agent 自动识别</w:t>
-      </w:r>
-    </w:p>
-    <w:p>
-      <w:pPr>
-        <w:pStyle w:val="ListBullet"/>
-      </w:pPr>
-      <w:r>
-        <w:t>其他 Agent：复制 SKILL.md 内容作为系统指令</w:t>
+        <w:t>Skill 文件（SKILL.md）是 Prompt 模板，用于指导 AI Agent 执行内容生成。将 SKILL.md 的内容作为系统提示或工具描述加载给 AI Agent 即可。</w:t>
       </w:r>
     </w:p>
     <w:p>
@@ -1008,11 +1344,6 @@
       </w:pPr>
       <w:r>
         <w:t>Skill 执行流程</w:t>
-      </w:r>
-    </w:p>
-    <w:p>
-      <w:r>
-        <w:t>AI Agent 读取 SKILL.md 后，按以下流程执行：</w:t>
       </w:r>
     </w:p>
     <w:p>
@@ -1052,20 +1383,12 @@
         <w:pStyle w:val="Heading1"/>
       </w:pPr>
       <w:r>
-        <w:t>9. Workflow 使用说明</w:t>
+        <w:t>10. Workflow 使用说明</w:t>
       </w:r>
     </w:p>
     <w:p>
       <w:r>
-        <w:t>Workflow 文件（workflow.social-content.yaml）是机器可读的流程编排文件。它声明了所需工具、步骤串联方式和输入输出格式，支持工作流引擎自动加载和执行。</w:t>
-      </w:r>
-    </w:p>
-    <w:p>
-      <w:pPr>
-        <w:pStyle w:val="Heading2"/>
-      </w:pPr>
-      <w:r>
-        <w:t>Workflow 步骤概览</w:t>
+        <w:t>Workflow 文件（workflow.social-content.yaml）是机器可读的流程编排文件，声明了所需工具、步骤串联方式和输入输出格式。</w:t>
       </w:r>
     </w:p>
     <w:tbl>
@@ -1261,7 +1584,7 @@
         <w:pStyle w:val="Heading1"/>
       </w:pPr>
       <w:r>
-        <w:t>10. 输出说明</w:t>
+        <w:t>11. 输出说明</w:t>
       </w:r>
     </w:p>
     <w:p>
@@ -1422,12 +1745,13 @@
         </w:tc>
       </w:tr>
     </w:tbl>
+    <w:p/>
     <w:p>
       <w:pPr>
         <w:pStyle w:val="Heading1"/>
       </w:pPr>
       <w:r>
-        <w:t>11. 故障排除</w:t>
+        <w:t>12. 故障排除</w:t>
       </w:r>
     </w:p>
     <w:p>
@@ -1492,8 +1816,6 @@
     <w:p>
       <w:r>
         <w:t>A：确认所有文件保存为 UTF-8 编码</w:t>
-        <w:br/>
-        <w:t>确认操作系统区域设置支持中文</w:t>
         <w:br/>
         <w:t>Excel 中文字体依赖系统字库</w:t>
       </w:r>
@@ -1778,12 +2100,10 @@
     </w:p>
     <w:p>
       <w:r>
-        <w:t>如有问题或建议，请联系项目维护者。</w:t>
-        <w:br/>
-        <w:t>项目地址：https://github.com/cocolu9309-cloud/marketing-intelligency</w:t>
+        <w:t>项目地址：https://github.com/cocolu9309-cloud/callie-social-content-workflow</w:t>
         <w:br/>
         <w:br/>
-        <w:t>—— 手册版本：v1.0.0 | 更新日期：2026-06-15 ——</w:t>
+        <w:t>—— 手册版本：v1.0.1 | 更新日期：2026-06-15 ——</w:t>
       </w:r>
     </w:p>
     <w:sectPr>

</xml_diff>